<commit_message>
docs: make camera optional with soft matching
Camera is chosen per booking again. Like Quiet mode, camera-off users
are matched with camera-off users first, then with camera-on users,
whose screen shows a "Camera off" badge.

Co-Authored-By: Claude Opus 5.5 <noreply@anthropic.com>
</commit_message>
<xml_diff>
--- a/docs/FocusUp_SPEC_v1.1.docx
+++ b/docs/FocusUp_SPEC_v1.1.docx
@@ -112,18 +112,7 @@
         <w:t xml:space="preserve">Why us vs Focusmate:</w:t>
       </w:r>
       <w:r>
-        <w:t xml:space="preserve"> cheaper with local payment, a more generous free tier (6 sessions/week), optional same-gender matching, a "hide my photo" privacy option, built for Arab users (Arabic in v2). </w:t>
-      </w:r>
-      <w:r>
-        <w:rPr>
-          <w:b/>
-          <w:bCs/>
-          <w:color w:val="C55A11"/>
-        </w:rPr>
-        <w:t xml:space="preserve">[v1.1]</w:t>
-      </w:r>
-      <w:r>
-        <w:t xml:space="preserve"> Camera is required, as on Focusmate; the camera on/off choice is removed.</w:t>
+        <w:t xml:space="preserve"> cheaper with local payment, a more generous free tier (6 sessions/week), camera optional (unlike Focusmate), optional same-gender matching, a "hide my photo" privacy option, built for Arab users (Arabic in v2).</w:t>
       </w:r>
     </w:p>
     <w:p>
@@ -1640,7 +1629,7 @@
                 <w:sz w:val="19"/>
                 <w:szCs w:val="19"/>
               </w:rPr>
-              <w:t xml:space="preserve"> Camera required for everyone, as on Focusmate. No camera-off option</w:t>
+              <w:t xml:space="preserve"> Optional, chosen per booking. Soft preference: a camera-off user is matched with a waiting camera-off user first; if none, with a camera-on user, and the partner sees a "Camera off" badge (avatar + name shown)</w:t>
             </w:r>
           </w:p>
         </w:tc>
@@ -5547,7 +5536,7 @@
         <w:t xml:space="preserve">[v1.1]</w:t>
       </w:r>
       <w:r>
-        <w:t xml:space="preserve"> As a user, I turn on Quiet mode, so I'm matched with other Quiet users when possible and my partner knows I won't talk.</w:t>
+        <w:t xml:space="preserve"> As a user, I choose camera on/off and Quiet mode, so I'm matched with people who chose the same when possible, and my partner sees a badge when our choices differ.</w:t>
       </w:r>
     </w:p>
     <w:p>
@@ -6104,7 +6093,7 @@
                 <w:sz w:val="19"/>
                 <w:szCs w:val="19"/>
               </w:rPr>
-              <w:t xml:space="preserve">Booking options: Quiet, Desk/Walk, same-gender (optional), "flexible"</w:t>
+              <w:t xml:space="preserve">Booking options: camera on/off, Quiet, Desk/Walk, same-gender (optional), "flexible"</w:t>
             </w:r>
           </w:p>
         </w:tc>
@@ -6956,27 +6945,6 @@
       </w:pPr>
       <w:r>
         <w:t xml:space="preserve">Instant "Focus Now" matching.</w:t>
-      </w:r>
-    </w:p>
-    <w:p>
-      <w:pPr>
-        <w:pStyle w:val="ListParagraph"/>
-        <w:numPr>
-          <w:ilvl w:val="0"/>
-          <w:numId w:val="2"/>
-        </w:numPr>
-        <w:spacing w:after="60"/>
-      </w:pPr>
-      <w:r>
-        <w:rPr>
-          <w:b/>
-          <w:bCs/>
-          <w:color w:val="C55A11"/>
-        </w:rPr>
-        <w:t xml:space="preserve">[v1.1]</w:t>
-      </w:r>
-      <w:r>
-        <w:t xml:space="preserve"> Camera-off sessions.</w:t>
       </w:r>
     </w:p>
     <w:p>
@@ -7553,7 +7521,7 @@
                 <w:sz w:val="19"/>
                 <w:szCs w:val="19"/>
               </w:rPr>
-              <w:t xml:space="preserve">Focus: camera on, mic optional (Quiet = mic disabled)</w:t>
+              <w:t xml:space="preserve">Focus: camera per booking choice, mic optional (Quiet = mic disabled)</w:t>
             </w:r>
           </w:p>
         </w:tc>
@@ -7852,6 +7820,13 @@
             </w:pPr>
             <w:r>
               <w:rPr>
+                <w:sz w:val="19"/>
+                <w:szCs w:val="19"/>
+              </w:rPr>
+              <w:t xml:space="preserve">Per booking: camera on/off. Camera-off users show avatar + name. </w:t>
+            </w:r>
+            <w:r>
+              <w:rPr>
                 <w:b/>
                 <w:bCs/>
                 <w:color w:val="C55A11"/>
@@ -7865,7 +7840,7 @@
                 <w:sz w:val="19"/>
                 <w:szCs w:val="19"/>
               </w:rPr>
-              <w:t xml:space="preserve"> Camera required. If the camera fails, show avatar + name and a "camera problem" notice [A]</w:t>
+              <w:t xml:space="preserve"> When choices differ, the camera-on partner sees a "Camera off" badge</w:t>
             </w:r>
           </w:p>
         </w:tc>
@@ -8803,6 +8778,68 @@
                 <w:sz w:val="19"/>
                 <w:szCs w:val="19"/>
               </w:rPr>
+              <w:t xml:space="preserve"> Camera on/off</w:t>
+            </w:r>
+          </w:p>
+        </w:tc>
+        <w:tc>
+          <w:tcPr>
+            <w:tcW w:type="dxa" w:w="4819"/>
+            <w:tcMar>
+              <w:top w:type="dxa" w:w="50"/>
+              <w:left w:type="dxa" w:w="90"/>
+              <w:bottom w:type="dxa" w:w="50"/>
+              <w:right w:type="dxa" w:w="90"/>
+            </w:tcMar>
+          </w:tcPr>
+          <w:p>
+            <w:pPr>
+              <w:spacing w:after="0"/>
+            </w:pPr>
+            <w:r>
+              <w:rPr>
+                <w:sz w:val="19"/>
+                <w:szCs w:val="19"/>
+              </w:rPr>
+              <w:t xml:space="preserve">Soft: prefer the same choice; a cross-match shows the "Camera off" badge</w:t>
+            </w:r>
+          </w:p>
+        </w:tc>
+      </w:tr>
+      <w:tr>
+        <w:trPr>
+          <w:cantSplit/>
+          <w:tblHeader w:val="false"/>
+        </w:trPr>
+        <w:tc>
+          <w:tcPr>
+            <w:tcW w:type="dxa" w:w="4819"/>
+            <w:tcMar>
+              <w:top w:type="dxa" w:w="50"/>
+              <w:left w:type="dxa" w:w="90"/>
+              <w:bottom w:type="dxa" w:w="50"/>
+              <w:right w:type="dxa" w:w="90"/>
+            </w:tcMar>
+          </w:tcPr>
+          <w:p>
+            <w:pPr>
+              <w:spacing w:after="0"/>
+            </w:pPr>
+            <w:r>
+              <w:rPr>
+                <w:b/>
+                <w:bCs/>
+                <w:color w:val="C55A11"/>
+                <w:sz w:val="19"/>
+                <w:szCs w:val="19"/>
+              </w:rPr>
+              <w:t xml:space="preserve">[v1.1]</w:t>
+            </w:r>
+            <w:r>
+              <w:rPr>
+                <w:sz w:val="19"/>
+                <w:szCs w:val="19"/>
+              </w:rPr>
               <w:t xml:space="preserve"> Quiet</w:t>
             </w:r>
           </w:p>
@@ -8826,7 +8863,7 @@
                 <w:sz w:val="19"/>
                 <w:szCs w:val="19"/>
               </w:rPr>
-              <w:t xml:space="preserve">Soft: prefer Quiet with Quiet; a cross-match shows the badge</w:t>
+              <w:t xml:space="preserve">Soft: prefer Quiet with Quiet; a cross-match shows the "Quiet mode" badge</w:t>
             </w:r>
           </w:p>
         </w:tc>
@@ -8951,7 +8988,7 @@
         <w:t xml:space="preserve">[v1.1]</w:t>
       </w:r>
       <w:r>
-        <w:t xml:space="preserve"> Order among compatible waiting bookings [A]: favorites → same Quiet choice → same Desk/Walk → oldest booking.</w:t>
+        <w:t xml:space="preserve"> Order among compatible waiting bookings [A]: favorites → same camera choice → same Quiet choice → same Desk/Walk → oldest booking.</w:t>
       </w:r>
     </w:p>
     <w:p>
@@ -8961,7 +8998,7 @@
     </w:p>
     <w:p>
       <w:r>
-        <w:t xml:space="preserve">With camera required and Quiet soft, each start time has only 3 pools (one per duration), plus a split for users who ask for same-gender. v1 had 12.</w:t>
+        <w:t xml:space="preserve">With camera and Quiet as soft preferences, each start time has only 3 pools (one per duration), plus a split for users who ask for same-gender. v1 had 12.</w:t>
       </w:r>
     </w:p>
     <w:p>
@@ -12140,6 +12177,19 @@
         <w:spacing w:after="60"/>
       </w:pPr>
       <w:r>
+        <w:t xml:space="preserve">Camera-off and Quiet enforced in the token's permissions (no camera / no microphone source).</w:t>
+      </w:r>
+    </w:p>
+    <w:p>
+      <w:pPr>
+        <w:pStyle w:val="ListParagraph"/>
+        <w:numPr>
+          <w:ilvl w:val="0"/>
+          <w:numId w:val="2"/>
+        </w:numPr>
+        <w:spacing w:after="60"/>
+      </w:pPr>
+      <w:r>
         <w:rPr>
           <w:b/>
           <w:bCs/>
@@ -12148,27 +12198,6 @@
         <w:t xml:space="preserve">[v1.1]</w:t>
       </w:r>
       <w:r>
-        <w:t xml:space="preserve"> Quiet enforced in the token's permissions (no microphone source). Camera required for everyone.</w:t>
-      </w:r>
-    </w:p>
-    <w:p>
-      <w:pPr>
-        <w:pStyle w:val="ListParagraph"/>
-        <w:numPr>
-          <w:ilvl w:val="0"/>
-          <w:numId w:val="2"/>
-        </w:numPr>
-        <w:spacing w:after="60"/>
-      </w:pPr>
-      <w:r>
-        <w:rPr>
-          <w:b/>
-          <w:bCs/>
-          <w:color w:val="C55A11"/>
-        </w:rPr>
-        <w:t xml:space="preserve">[v1.1]</w:t>
-      </w:r>
-      <w:r>
         <w:t xml:space="preserve"> Webhooks are signature-verified and are the source of truth for join/leave.</w:t>
       </w:r>
     </w:p>
@@ -12471,7 +12500,21 @@
           <w:sz w:val="15"/>
           <w:szCs w:val="15"/>
         </w:rPr>
-        <w:t xml:space="preserve">  quiet         Boolean       // [v1.1] soft preference; cameraOn removed</w:t>
+        <w:t xml:space="preserve">  cameraOn      Boolean       // [v1.1] soft preference</w:t>
+      </w:r>
+    </w:p>
+    <w:p>
+      <w:pPr>
+        <w:shd w:fill="F3F4F6" w:color="auto" w:val="clear"/>
+        <w:spacing w:after="0" w:line="240"/>
+      </w:pPr>
+      <w:r>
+        <w:rPr>
+          <w:rFonts w:ascii="Consolas" w:cs="Consolas" w:eastAsia="Consolas" w:hAnsi="Consolas"/>
+          <w:sz w:val="15"/>
+          <w:szCs w:val="15"/>
+        </w:rPr>
+        <w:t xml:space="preserve">  quiet         Boolean       // [v1.1] soft preference</w:t>
       </w:r>
     </w:p>
     <w:p>
@@ -16709,7 +16752,7 @@
                 <w:sz w:val="19"/>
                 <w:szCs w:val="19"/>
               </w:rPr>
-              <w:t xml:space="preserve">Focusmate experience (camera required, soft Quiet, booked people on calendar, lock at booking, rematch T+1 / solo T+3); beta sign-in = email + Google; one-server hosting; REST-only backend, Better Auth, Redis/BullMQ, socket.io; video preset; beta date and success criteria. Details in </w:t>
+              <w:t xml:space="preserve">Focusmate experience (camera and Quiet as soft preferences with badges, booked people on calendar, lock at booking, rematch T+1 / solo T+3); beta sign-in = email + Google; one-server hosting; REST-only backend, Better Auth, Redis/BullMQ, socket.io; video preset; beta date and success criteria. Details in </w:t>
             </w:r>
             <w:r>
               <w:rPr>

</xml_diff>

<commit_message>
docs: drop phone/Facebook sign-in, dynamic video, pg-boss for jobs
- Sign-in is email + password and Google only.
- Video adapts per connection (VP8 simulcast up to 720p) with a
  Data saver setting that caps at 360p.
- Background jobs move from Redis/BullMQ to pg-boss: idempotent
  handlers plus a reconcile step at startup and every 15 minutes.

Co-Authored-By: Claude Opus 5.5 <noreply@anthropic.com>
</commit_message>
<xml_diff>
--- a/docs/FocusUp_SPEC_v1.1.docx
+++ b/docs/FocusUp_SPEC_v1.1.docx
@@ -154,7 +154,7 @@
         <w:t xml:space="preserve">apps/api</w:t>
       </w:r>
       <w:r>
-        <w:t xml:space="preserve">) + Prisma + PostgreSQL 17 + Redis/BullMQ + self-hosted LiveKit, all on one server with one domain.</w:t>
+        <w:t xml:space="preserve">) + Prisma + PostgreSQL 17 + self-hosted LiveKit, all on one server with one domain. No Redis.</w:t>
       </w:r>
     </w:p>
     <w:p>
@@ -225,7 +225,7 @@
         <w:t xml:space="preserve">Friday 20 November 2026</w:t>
       </w:r>
       <w:r>
-        <w:t xml:space="preserve">. Payments, extra sign-in methods and hardening follow; public launch date decided after the mid-December beta review.</w:t>
+        <w:t xml:space="preserve">. Payments and hardening follow; public launch date decided after the mid-December beta review.</w:t>
       </w:r>
     </w:p>
     <w:p>
@@ -2443,7 +2443,7 @@
                 <w:sz w:val="19"/>
                 <w:szCs w:val="19"/>
               </w:rPr>
-              <w:t xml:space="preserve"> Beta: email + password and Google. Phone (OTP) and Facebook added before public launch</w:t>
+              <w:t xml:space="preserve"> Email + password and Google only. No phone (OTP) or Facebook sign-in</w:t>
             </w:r>
           </w:p>
         </w:tc>
@@ -4247,7 +4247,7 @@
                 <w:sz w:val="19"/>
                 <w:szCs w:val="19"/>
               </w:rPr>
-              <w:t xml:space="preserve"> 960×540 @ 24 fps, max ~600 kbps, VP8 with simulcast</w:t>
+              <w:t xml:space="preserve"> Dynamic: adapts to each connection, up to 720p. "Data saver" setting caps it at 360p</w:t>
             </w:r>
           </w:p>
         </w:tc>
@@ -4586,7 +4586,7 @@
                 <w:sz w:val="19"/>
                 <w:szCs w:val="19"/>
               </w:rPr>
-              <w:t xml:space="preserve"> Redis + BullMQ with a 1-minute recovery sweep (replaces pg-boss)</w:t>
+              <w:t xml:space="preserve"> pg-boss (job queue stored in Postgres). No Redis. A reconcile step re-creates any missing job at startup and every 15 minutes</w:t>
             </w:r>
           </w:p>
         </w:tc>
@@ -5570,6 +5570,27 @@
         <w:spacing w:after="60"/>
       </w:pPr>
       <w:r>
+        <w:rPr>
+          <w:b/>
+          <w:bCs/>
+          <w:color w:val="C55A11"/>
+        </w:rPr>
+        <w:t xml:space="preserve">[v1.1]</w:t>
+      </w:r>
+      <w:r>
+        <w:t xml:space="preserve"> As a user on mobile data, I turn on Data saver so sessions use less data.</w:t>
+      </w:r>
+    </w:p>
+    <w:p>
+      <w:pPr>
+        <w:pStyle w:val="ListParagraph"/>
+        <w:numPr>
+          <w:ilvl w:val="0"/>
+          <w:numId w:val="2"/>
+        </w:numPr>
+        <w:spacing w:after="60"/>
+      </w:pPr>
+      <w:r>
         <w:t xml:space="preserve">As a user, I join the room, write my goal, optionally say hi, work, then mark what I finished.</w:t>
       </w:r>
     </w:p>
@@ -5868,81 +5889,6 @@
                 <w:sz w:val="19"/>
                 <w:szCs w:val="19"/>
               </w:rPr>
-              <w:t xml:space="preserve">Sign-up/login: phone OTP, Facebook</w:t>
-            </w:r>
-          </w:p>
-        </w:tc>
-        <w:tc>
-          <w:tcPr>
-            <w:tcW w:type="dxa" w:w="2339"/>
-            <w:tcMar>
-              <w:top w:type="dxa" w:w="50"/>
-              <w:left w:type="dxa" w:w="90"/>
-              <w:bottom w:type="dxa" w:w="50"/>
-              <w:right w:type="dxa" w:w="90"/>
-            </w:tcMar>
-          </w:tcPr>
-          <w:p>
-            <w:pPr>
-              <w:spacing w:after="0"/>
-            </w:pPr>
-            <w:r>
-              <w:rPr>
-                <w:sz w:val="19"/>
-                <w:szCs w:val="19"/>
-              </w:rPr>
-              <w:t xml:space="preserve">No</w:t>
-            </w:r>
-          </w:p>
-        </w:tc>
-        <w:tc>
-          <w:tcPr>
-            <w:tcW w:type="dxa" w:w="1685"/>
-            <w:tcMar>
-              <w:top w:type="dxa" w:w="50"/>
-              <w:left w:type="dxa" w:w="90"/>
-              <w:bottom w:type="dxa" w:w="50"/>
-              <w:right w:type="dxa" w:w="90"/>
-            </w:tcMar>
-          </w:tcPr>
-          <w:p>
-            <w:pPr>
-              <w:spacing w:after="0"/>
-            </w:pPr>
-            <w:r>
-              <w:rPr>
-                <w:sz w:val="19"/>
-                <w:szCs w:val="19"/>
-              </w:rPr>
-              <w:t xml:space="preserve">Yes</w:t>
-            </w:r>
-          </w:p>
-        </w:tc>
-      </w:tr>
-      <w:tr>
-        <w:trPr>
-          <w:cantSplit/>
-          <w:tblHeader w:val="false"/>
-        </w:trPr>
-        <w:tc>
-          <w:tcPr>
-            <w:tcW w:type="dxa" w:w="5614"/>
-            <w:tcMar>
-              <w:top w:type="dxa" w:w="50"/>
-              <w:left w:type="dxa" w:w="90"/>
-              <w:bottom w:type="dxa" w:w="50"/>
-              <w:right w:type="dxa" w:w="90"/>
-            </w:tcMar>
-          </w:tcPr>
-          <w:p>
-            <w:pPr>
-              <w:spacing w:after="0"/>
-            </w:pPr>
-            <w:r>
-              <w:rPr>
-                <w:sz w:val="19"/>
-                <w:szCs w:val="19"/>
-              </w:rPr>
               <w:t xml:space="preserve">Onboarding: display name + photo; timezone auto-detected from the browser</w:t>
             </w:r>
           </w:p>
@@ -7902,7 +7848,7 @@
                 <w:sz w:val="19"/>
                 <w:szCs w:val="19"/>
               </w:rPr>
-              <w:t xml:space="preserve"> 960×540 @ 24 fps, max ~600 kbps, VP8 with simulcast, adaptive stream + dynacast. About 450 MB per 50-min session (send + receive)</w:t>
+              <w:t xml:space="preserve"> Dynamic. Each user sends 3 simulcast layers (about 180p / 360p / 720p). LiveKit gives the partner the layer their connection can handle and switches live (adaptive stream); layers nobody watches stop being encoded (dynacast). "Data saver" caps the user's video at 360p, about a quarter of the data of full HD (which can reach ~1.3 GB per 50-min session, send + receive). VP8 for the widest device support [A]</w:t>
             </w:r>
           </w:p>
         </w:tc>
@@ -9777,7 +9723,7 @@
         <w:t xml:space="preserve">[v1.1]</w:t>
       </w:r>
       <w:r>
-        <w:t xml:space="preserve"> Phone OTP arrives before public launch; [R] later make it required for users with reports.</w:t>
+        <w:t xml:space="preserve"> No phone or Facebook sign-in. Accounts are email + password (verified) or Google.</w:t>
       </w:r>
     </w:p>
     <w:p>
@@ -9929,7 +9875,18 @@
         <w:t xml:space="preserve">[v1.1]</w:t>
       </w:r>
       <w:r>
-        <w:t xml:space="preserve"> hide my photo, timezone, notification preferences, linked login methods, subscription &amp; billing, data export, account deletion.</w:t>
+        <w:t xml:space="preserve"> hide my photo, </w:t>
+      </w:r>
+      <w:r>
+        <w:rPr>
+          <w:b/>
+          <w:bCs/>
+          <w:color w:val="C55A11"/>
+        </w:rPr>
+        <w:t xml:space="preserve">[v1.1]</w:t>
+      </w:r>
+      <w:r>
+        <w:t xml:space="preserve"> Data saver, timezone, notification preferences, linked login methods, subscription &amp; billing, data export, account deletion.</w:t>
       </w:r>
     </w:p>
     <w:p>
@@ -10619,7 +10576,7 @@
                 <w:sz w:val="19"/>
                 <w:szCs w:val="19"/>
               </w:rPr>
-              <w:t xml:space="preserve">Redis 7 + BullMQ</w:t>
+              <w:t xml:space="preserve">pg-boss</w:t>
             </w:r>
           </w:p>
         </w:tc>
@@ -10642,7 +10599,7 @@
                 <w:sz w:val="19"/>
                 <w:szCs w:val="19"/>
               </w:rPr>
-              <w:t xml:space="preserve">Separate worker container from the same image. AOF persistence, </w:t>
+              <w:t xml:space="preserve">Separate worker container from the same image. Jobs live in Postgres (own </w:t>
             </w:r>
             <w:r>
               <w:rPr>
@@ -10650,14 +10607,14 @@
                 <w:sz w:val="17"/>
                 <w:szCs w:val="17"/>
               </w:rPr>
-              <w:t xml:space="preserve">noeviction</w:t>
-            </w:r>
-            <w:r>
-              <w:rPr>
-                <w:sz w:val="19"/>
-                <w:szCs w:val="19"/>
-              </w:rPr>
-              <w:t xml:space="preserve">, 1-minute recovery sweep</w:t>
+              <w:t xml:space="preserve">pgboss</w:t>
+            </w:r>
+            <w:r>
+              <w:rPr>
+                <w:sz w:val="19"/>
+                <w:szCs w:val="19"/>
+              </w:rPr>
+              <w:t xml:space="preserve"> schema) with retries, backoff and schedules built in. Reconcile at startup + every 15 min</w:t>
             </w:r>
           </w:p>
         </w:tc>
@@ -10815,7 +10772,7 @@
                 <w:sz w:val="19"/>
                 <w:szCs w:val="19"/>
               </w:rPr>
-              <w:t xml:space="preserve">Email/password + Google (beta); phone-number and Facebook plugins before launch. httpOnly cookies</w:t>
+              <w:t xml:space="preserve">Email/password + Google only. httpOnly cookies</w:t>
             </w:r>
           </w:p>
         </w:tc>
@@ -11332,7 +11289,29 @@
     </w:p>
     <w:p>
       <w:r>
-        <w:t xml:space="preserve">Removed from v1: Vercel, Railway, Supabase, LiveKit Cloud, pg-boss, polling-only realtime. Removed earlier: Cal.com, Stripe. Removed from the repo: the oRPC scaffold (</w:t>
+        <w:t xml:space="preserve">Removed from v1: Vercel, Railway, Supabase, LiveKit Cloud, polling-only realtime (pg-boss is kept). Removed earlier: Cal.com, Stripe. To be removed from the repo: Redis and BullMQ (the current workers in </w:t>
+      </w:r>
+      <w:r>
+        <w:rPr>
+          <w:rFonts w:ascii="Consolas" w:cs="Consolas" w:eastAsia="Consolas" w:hAnsi="Consolas"/>
+          <w:sz w:val="19"/>
+          <w:szCs w:val="19"/>
+        </w:rPr>
+        <w:t xml:space="preserve">apps/api/src/queues</w:t>
+      </w:r>
+      <w:r>
+        <w:t xml:space="preserve"> and </w:t>
+      </w:r>
+      <w:r>
+        <w:rPr>
+          <w:rFonts w:ascii="Consolas" w:cs="Consolas" w:eastAsia="Consolas" w:hAnsi="Consolas"/>
+          <w:sz w:val="19"/>
+          <w:szCs w:val="19"/>
+        </w:rPr>
+        <w:t xml:space="preserve">apps/api/src/workers</w:t>
+      </w:r>
+      <w:r>
+        <w:t xml:space="preserve"> are replaced by pg-boss in week 6). Removed from the repo: the oRPC scaffold (</w:t>
       </w:r>
       <w:r>
         <w:rPr>
@@ -11415,7 +11394,7 @@
           <w:sz w:val="15"/>
           <w:szCs w:val="15"/>
         </w:rPr>
-        <w:t xml:space="preserve">                                       worker container (BullMQ workers + sweep)</w:t>
+        <w:t xml:space="preserve">                                       worker container (pg-boss workers)</w:t>
       </w:r>
     </w:p>
     <w:p>
@@ -11471,7 +11450,7 @@
           <w:sz w:val="15"/>
           <w:szCs w:val="15"/>
         </w:rPr>
-        <w:t xml:space="preserve">Postgres 17, Redis 7   → internal network only</w:t>
+        <w:t xml:space="preserve">Postgres 17            → internal network only</w:t>
       </w:r>
     </w:p>
     <w:p>
@@ -11603,7 +11582,12 @@
         <w:pStyle w:val="Heading2"/>
       </w:pPr>
       <w:r>
-        <w:t xml:space="preserve">9.4 Background jobs (BullMQ)</w:t>
+        <w:t xml:space="preserve">9.4 Background jobs (pg-boss) [v1.1]</w:t>
+      </w:r>
+    </w:p>
+    <w:p>
+      <w:r>
+        <w:t xml:space="preserve">Jobs are stored in Postgres, so they survive restarts and are included in database backups. They are queued right after the booking is saved, outside the Prisma transaction (no raw SQL), so every handler re-checks the booking before acting, and a reconcile step covers a crash between the two.</w:t>
       </w:r>
     </w:p>
     <w:tbl>
@@ -11620,8 +11604,9 @@
         <w:tblLayout w:type="fixed"/>
       </w:tblPr>
       <w:tblGrid>
-        <w:gridCol w:w="2498"/>
-        <w:gridCol w:w="7140"/>
+        <w:gridCol w:w="1770"/>
+        <w:gridCol w:w="3933"/>
+        <w:gridCol w:w="3935"/>
       </w:tblGrid>
       <w:tr>
         <w:trPr>
@@ -11630,7 +11615,7 @@
         </w:trPr>
         <w:tc>
           <w:tcPr>
-            <w:tcW w:type="dxa" w:w="2498"/>
+            <w:tcW w:type="dxa" w:w="1770"/>
             <w:shd w:fill="E7ECF2" w:color="auto" w:val="clear"/>
             <w:tcMar>
               <w:top w:type="dxa" w:w="50"/>
@@ -11656,7 +11641,7 @@
         </w:tc>
         <w:tc>
           <w:tcPr>
-            <w:tcW w:type="dxa" w:w="7140"/>
+            <w:tcW w:type="dxa" w:w="3933"/>
             <w:shd w:fill="E7ECF2" w:color="auto" w:val="clear"/>
             <w:tcMar>
               <w:top w:type="dxa" w:w="50"/>
@@ -11680,142 +11665,10 @@
             </w:r>
           </w:p>
         </w:tc>
-      </w:tr>
-      <w:tr>
-        <w:trPr>
-          <w:cantSplit/>
-          <w:tblHeader w:val="false"/>
-        </w:trPr>
-        <w:tc>
-          <w:tcPr>
-            <w:tcW w:type="dxa" w:w="2498"/>
-            <w:tcMar>
-              <w:top w:type="dxa" w:w="50"/>
-              <w:left w:type="dxa" w:w="90"/>
-              <w:bottom w:type="dxa" w:w="50"/>
-              <w:right w:type="dxa" w:w="90"/>
-            </w:tcMar>
-          </w:tcPr>
-          <w:p>
-            <w:pPr>
-              <w:spacing w:after="0"/>
-            </w:pPr>
-            <w:r>
-              <w:rPr>
-                <w:sz w:val="19"/>
-                <w:szCs w:val="19"/>
-              </w:rPr>
-              <w:t xml:space="preserve">reminder</w:t>
-            </w:r>
-          </w:p>
-        </w:tc>
-        <w:tc>
-          <w:tcPr>
-            <w:tcW w:type="dxa" w:w="7140"/>
-            <w:tcMar>
-              <w:top w:type="dxa" w:w="50"/>
-              <w:left w:type="dxa" w:w="90"/>
-              <w:bottom w:type="dxa" w:w="50"/>
-              <w:right w:type="dxa" w:w="90"/>
-            </w:tcMar>
-          </w:tcPr>
-          <w:p>
-            <w:pPr>
-              <w:spacing w:after="0"/>
-            </w:pPr>
-            <w:r>
-              <w:rPr>
-                <w:sz w:val="19"/>
-                <w:szCs w:val="19"/>
-              </w:rPr>
-              <w:t xml:space="preserve">T-24h, T-1h, T-10m per booking</w:t>
-            </w:r>
-          </w:p>
-        </w:tc>
-      </w:tr>
-      <w:tr>
-        <w:trPr>
-          <w:cantSplit/>
-          <w:tblHeader w:val="false"/>
-        </w:trPr>
-        <w:tc>
-          <w:tcPr>
-            <w:tcW w:type="dxa" w:w="2498"/>
-            <w:tcMar>
-              <w:top w:type="dxa" w:w="50"/>
-              <w:left w:type="dxa" w:w="90"/>
-              <w:bottom w:type="dxa" w:w="50"/>
-              <w:right w:type="dxa" w:w="90"/>
-            </w:tcMar>
-          </w:tcPr>
-          <w:p>
-            <w:pPr>
-              <w:spacing w:after="0"/>
-            </w:pPr>
-            <w:r>
-              <w:rPr>
-                <w:sz w:val="19"/>
-                <w:szCs w:val="19"/>
-              </w:rPr>
-              <w:t xml:space="preserve">relax-match</w:t>
-            </w:r>
-          </w:p>
-        </w:tc>
-        <w:tc>
-          <w:tcPr>
-            <w:tcW w:type="dxa" w:w="7140"/>
-            <w:tcMar>
-              <w:top w:type="dxa" w:w="50"/>
-              <w:left w:type="dxa" w:w="90"/>
-              <w:bottom w:type="dxa" w:w="50"/>
-              <w:right w:type="dxa" w:w="90"/>
-            </w:tcMar>
-          </w:tcPr>
-          <w:p>
-            <w:pPr>
-              <w:spacing w:after="0"/>
-            </w:pPr>
-            <w:r>
-              <w:rPr>
-                <w:sz w:val="19"/>
-                <w:szCs w:val="19"/>
-              </w:rPr>
-              <w:t xml:space="preserve">T-10m for unmatched flexible bookings with same-gender on</w:t>
-            </w:r>
-          </w:p>
-        </w:tc>
-      </w:tr>
-      <w:tr>
-        <w:trPr>
-          <w:cantSplit/>
-          <w:tblHeader w:val="false"/>
-        </w:trPr>
-        <w:tc>
-          <w:tcPr>
-            <w:tcW w:type="dxa" w:w="2498"/>
-            <w:tcMar>
-              <w:top w:type="dxa" w:w="50"/>
-              <w:left w:type="dxa" w:w="90"/>
-              <w:bottom w:type="dxa" w:w="50"/>
-              <w:right w:type="dxa" w:w="90"/>
-            </w:tcMar>
-          </w:tcPr>
-          <w:p>
-            <w:pPr>
-              <w:spacing w:after="0"/>
-            </w:pPr>
-            <w:r>
-              <w:rPr>
-                <w:sz w:val="19"/>
-                <w:szCs w:val="19"/>
-              </w:rPr>
-              <w:t xml:space="preserve">rematch</w:t>
-            </w:r>
-          </w:p>
-        </w:tc>
-        <w:tc>
-          <w:tcPr>
-            <w:tcW w:type="dxa" w:w="7140"/>
+        <w:tc>
+          <w:tcPr>
+            <w:tcW w:type="dxa" w:w="3935"/>
+            <w:shd w:fill="E7ECF2" w:color="auto" w:val="clear"/>
             <w:tcMar>
               <w:top w:type="dxa" w:w="50"/>
               <w:left w:type="dxa" w:w="90"/>
@@ -11831,18 +11684,10 @@
               <w:rPr>
                 <w:b/>
                 <w:bCs/>
-                <w:color w:val="C55A11"/>
-                <w:sz w:val="19"/>
-                <w:szCs w:val="19"/>
-              </w:rPr>
-              <w:t xml:space="preserve">[v1.1]</w:t>
-            </w:r>
-            <w:r>
-              <w:rPr>
-                <w:sz w:val="19"/>
-                <w:szCs w:val="19"/>
-              </w:rPr>
-              <w:t xml:space="preserve"> T+1m</w:t>
+                <w:sz w:val="19"/>
+                <w:szCs w:val="19"/>
+              </w:rPr>
+              <w:t xml:space="preserve">Idempotency</w:t>
             </w:r>
           </w:p>
         </w:tc>
@@ -11854,57 +11699,70 @@
         </w:trPr>
         <w:tc>
           <w:tcPr>
-            <w:tcW w:type="dxa" w:w="2498"/>
-            <w:tcMar>
-              <w:top w:type="dxa" w:w="50"/>
-              <w:left w:type="dxa" w:w="90"/>
-              <w:bottom w:type="dxa" w:w="50"/>
-              <w:right w:type="dxa" w:w="90"/>
-            </w:tcMar>
-          </w:tcPr>
-          <w:p>
-            <w:pPr>
-              <w:spacing w:after="0"/>
-            </w:pPr>
-            <w:r>
-              <w:rPr>
-                <w:sz w:val="19"/>
-                <w:szCs w:val="19"/>
-              </w:rPr>
-              <w:t xml:space="preserve">solo-offer</w:t>
-            </w:r>
-          </w:p>
-        </w:tc>
-        <w:tc>
-          <w:tcPr>
-            <w:tcW w:type="dxa" w:w="7140"/>
-            <w:tcMar>
-              <w:top w:type="dxa" w:w="50"/>
-              <w:left w:type="dxa" w:w="90"/>
-              <w:bottom w:type="dxa" w:w="50"/>
-              <w:right w:type="dxa" w:w="90"/>
-            </w:tcMar>
-          </w:tcPr>
-          <w:p>
-            <w:pPr>
-              <w:spacing w:after="0"/>
-            </w:pPr>
-            <w:r>
-              <w:rPr>
-                <w:b/>
-                <w:bCs/>
-                <w:color w:val="C55A11"/>
-                <w:sz w:val="19"/>
-                <w:szCs w:val="19"/>
-              </w:rPr>
-              <w:t xml:space="preserve">[v1.1]</w:t>
-            </w:r>
-            <w:r>
-              <w:rPr>
-                <w:sz w:val="19"/>
-                <w:szCs w:val="19"/>
-              </w:rPr>
-              <w:t xml:space="preserve"> T+3m</w:t>
+            <w:tcW w:type="dxa" w:w="1770"/>
+            <w:tcMar>
+              <w:top w:type="dxa" w:w="50"/>
+              <w:left w:type="dxa" w:w="90"/>
+              <w:bottom w:type="dxa" w:w="50"/>
+              <w:right w:type="dxa" w:w="90"/>
+            </w:tcMar>
+          </w:tcPr>
+          <w:p>
+            <w:pPr>
+              <w:spacing w:after="0"/>
+            </w:pPr>
+            <w:r>
+              <w:rPr>
+                <w:sz w:val="19"/>
+                <w:szCs w:val="19"/>
+              </w:rPr>
+              <w:t xml:space="preserve">reminder</w:t>
+            </w:r>
+          </w:p>
+        </w:tc>
+        <w:tc>
+          <w:tcPr>
+            <w:tcW w:type="dxa" w:w="3933"/>
+            <w:tcMar>
+              <w:top w:type="dxa" w:w="50"/>
+              <w:left w:type="dxa" w:w="90"/>
+              <w:bottom w:type="dxa" w:w="50"/>
+              <w:right w:type="dxa" w:w="90"/>
+            </w:tcMar>
+          </w:tcPr>
+          <w:p>
+            <w:pPr>
+              <w:spacing w:after="0"/>
+            </w:pPr>
+            <w:r>
+              <w:rPr>
+                <w:sz w:val="19"/>
+                <w:szCs w:val="19"/>
+              </w:rPr>
+              <w:t xml:space="preserve">T-24h, T-1h, T-10m per booking</w:t>
+            </w:r>
+          </w:p>
+        </w:tc>
+        <w:tc>
+          <w:tcPr>
+            <w:tcW w:type="dxa" w:w="3935"/>
+            <w:tcMar>
+              <w:top w:type="dxa" w:w="50"/>
+              <w:left w:type="dxa" w:w="90"/>
+              <w:bottom w:type="dxa" w:w="50"/>
+              <w:right w:type="dxa" w:w="90"/>
+            </w:tcMar>
+          </w:tcPr>
+          <w:p>
+            <w:pPr>
+              <w:spacing w:after="0"/>
+            </w:pPr>
+            <w:r>
+              <w:rPr>
+                <w:sz w:val="19"/>
+                <w:szCs w:val="19"/>
+              </w:rPr>
+              <w:t xml:space="preserve">Singleton key per booking + reminder; skipped if booking cancelled</w:t>
             </w:r>
           </w:p>
         </w:tc>
@@ -11916,7 +11774,97 @@
         </w:trPr>
         <w:tc>
           <w:tcPr>
-            <w:tcW w:type="dxa" w:w="2498"/>
+            <w:tcW w:type="dxa" w:w="1770"/>
+            <w:tcMar>
+              <w:top w:type="dxa" w:w="50"/>
+              <w:left w:type="dxa" w:w="90"/>
+              <w:bottom w:type="dxa" w:w="50"/>
+              <w:right w:type="dxa" w:w="90"/>
+            </w:tcMar>
+          </w:tcPr>
+          <w:p>
+            <w:pPr>
+              <w:spacing w:after="0"/>
+            </w:pPr>
+            <w:r>
+              <w:rPr>
+                <w:sz w:val="19"/>
+                <w:szCs w:val="19"/>
+              </w:rPr>
+              <w:t xml:space="preserve">relax-match</w:t>
+            </w:r>
+          </w:p>
+        </w:tc>
+        <w:tc>
+          <w:tcPr>
+            <w:tcW w:type="dxa" w:w="3933"/>
+            <w:tcMar>
+              <w:top w:type="dxa" w:w="50"/>
+              <w:left w:type="dxa" w:w="90"/>
+              <w:bottom w:type="dxa" w:w="50"/>
+              <w:right w:type="dxa" w:w="90"/>
+            </w:tcMar>
+          </w:tcPr>
+          <w:p>
+            <w:pPr>
+              <w:spacing w:after="0"/>
+            </w:pPr>
+            <w:r>
+              <w:rPr>
+                <w:sz w:val="19"/>
+                <w:szCs w:val="19"/>
+              </w:rPr>
+              <w:t xml:space="preserve">T-10m for unmatched flexible bookings with same-gender on</w:t>
+            </w:r>
+          </w:p>
+        </w:tc>
+        <w:tc>
+          <w:tcPr>
+            <w:tcW w:type="dxa" w:w="3935"/>
+            <w:tcMar>
+              <w:top w:type="dxa" w:w="50"/>
+              <w:left w:type="dxa" w:w="90"/>
+              <w:bottom w:type="dxa" w:w="50"/>
+              <w:right w:type="dxa" w:w="90"/>
+            </w:tcMar>
+          </w:tcPr>
+          <w:p>
+            <w:pPr>
+              <w:spacing w:after="0"/>
+            </w:pPr>
+            <w:r>
+              <w:rPr>
+                <w:sz w:val="19"/>
+                <w:szCs w:val="19"/>
+              </w:rPr>
+              <w:t xml:space="preserve">Skipped if already matched or </w:t>
+            </w:r>
+            <w:r>
+              <w:rPr>
+                <w:rFonts w:ascii="Consolas" w:cs="Consolas" w:eastAsia="Consolas" w:hAnsi="Consolas"/>
+                <w:sz w:val="17"/>
+                <w:szCs w:val="17"/>
+              </w:rPr>
+              <w:t xml:space="preserve">Booking.relaxedAt</w:t>
+            </w:r>
+            <w:r>
+              <w:rPr>
+                <w:sz w:val="19"/>
+                <w:szCs w:val="19"/>
+              </w:rPr>
+              <w:t xml:space="preserve"> set</w:t>
+            </w:r>
+          </w:p>
+        </w:tc>
+      </w:tr>
+      <w:tr>
+        <w:trPr>
+          <w:cantSplit/>
+          <w:tblHeader w:val="false"/>
+        </w:trPr>
+        <w:tc>
+          <w:tcPr>
+            <w:tcW w:type="dxa" w:w="1770"/>
             <w:tcMar>
               <w:top w:type="dxa" w:w="50"/>
               <w:left w:type="dxa" w:w="90"/>
@@ -11939,7 +11887,7 @@
         </w:tc>
         <w:tc>
           <w:tcPr>
-            <w:tcW w:type="dxa" w:w="7140"/>
+            <w:tcW w:type="dxa" w:w="3933"/>
             <w:tcMar>
               <w:top w:type="dxa" w:w="50"/>
               <w:left w:type="dxa" w:w="90"/>
@@ -11960,6 +11908,29 @@
             </w:r>
           </w:p>
         </w:tc>
+        <w:tc>
+          <w:tcPr>
+            <w:tcW w:type="dxa" w:w="3935"/>
+            <w:tcMar>
+              <w:top w:type="dxa" w:w="50"/>
+              <w:left w:type="dxa" w:w="90"/>
+              <w:bottom w:type="dxa" w:w="50"/>
+              <w:right w:type="dxa" w:w="90"/>
+            </w:tcMar>
+          </w:tcPr>
+          <w:p>
+            <w:pPr>
+              <w:spacing w:after="0"/>
+            </w:pPr>
+            <w:r>
+              <w:rPr>
+                <w:sz w:val="19"/>
+                <w:szCs w:val="19"/>
+              </w:rPr>
+              <w:t xml:space="preserve">Skipped unless booking is still MATCHED with no join</w:t>
+            </w:r>
+          </w:p>
+        </w:tc>
       </w:tr>
       <w:tr>
         <w:trPr>
@@ -11968,47 +11939,70 @@
         </w:trPr>
         <w:tc>
           <w:tcPr>
-            <w:tcW w:type="dxa" w:w="2498"/>
-            <w:tcMar>
-              <w:top w:type="dxa" w:w="50"/>
-              <w:left w:type="dxa" w:w="90"/>
-              <w:bottom w:type="dxa" w:w="50"/>
-              <w:right w:type="dxa" w:w="90"/>
-            </w:tcMar>
-          </w:tcPr>
-          <w:p>
-            <w:pPr>
-              <w:spacing w:after="0"/>
-            </w:pPr>
-            <w:r>
-              <w:rPr>
-                <w:sz w:val="19"/>
-                <w:szCs w:val="19"/>
-              </w:rPr>
-              <w:t xml:space="preserve">suspension-check</w:t>
-            </w:r>
-          </w:p>
-        </w:tc>
-        <w:tc>
-          <w:tcPr>
-            <w:tcW w:type="dxa" w:w="7140"/>
-            <w:tcMar>
-              <w:top w:type="dxa" w:w="50"/>
-              <w:left w:type="dxa" w:w="90"/>
-              <w:bottom w:type="dxa" w:w="50"/>
-              <w:right w:type="dxa" w:w="90"/>
-            </w:tcMar>
-          </w:tcPr>
-          <w:p>
-            <w:pPr>
-              <w:spacing w:after="0"/>
-            </w:pPr>
-            <w:r>
-              <w:rPr>
-                <w:sz w:val="19"/>
-                <w:szCs w:val="19"/>
-              </w:rPr>
-              <w:t xml:space="preserve">After each new strike/report</w:t>
+            <w:tcW w:type="dxa" w:w="1770"/>
+            <w:tcMar>
+              <w:top w:type="dxa" w:w="50"/>
+              <w:left w:type="dxa" w:w="90"/>
+              <w:bottom w:type="dxa" w:w="50"/>
+              <w:right w:type="dxa" w:w="90"/>
+            </w:tcMar>
+          </w:tcPr>
+          <w:p>
+            <w:pPr>
+              <w:spacing w:after="0"/>
+            </w:pPr>
+            <w:r>
+              <w:rPr>
+                <w:sz w:val="19"/>
+                <w:szCs w:val="19"/>
+              </w:rPr>
+              <w:t xml:space="preserve">session-close</w:t>
+            </w:r>
+          </w:p>
+        </w:tc>
+        <w:tc>
+          <w:tcPr>
+            <w:tcW w:type="dxa" w:w="3933"/>
+            <w:tcMar>
+              <w:top w:type="dxa" w:w="50"/>
+              <w:left w:type="dxa" w:w="90"/>
+              <w:bottom w:type="dxa" w:w="50"/>
+              <w:right w:type="dxa" w:w="90"/>
+            </w:tcMar>
+          </w:tcPr>
+          <w:p>
+            <w:pPr>
+              <w:spacing w:after="0"/>
+            </w:pPr>
+            <w:r>
+              <w:rPr>
+                <w:sz w:val="19"/>
+                <w:szCs w:val="19"/>
+              </w:rPr>
+              <w:t xml:space="preserve">End + 2 min</w:t>
+            </w:r>
+          </w:p>
+        </w:tc>
+        <w:tc>
+          <w:tcPr>
+            <w:tcW w:type="dxa" w:w="3935"/>
+            <w:tcMar>
+              <w:top w:type="dxa" w:w="50"/>
+              <w:left w:type="dxa" w:w="90"/>
+              <w:bottom w:type="dxa" w:w="50"/>
+              <w:right w:type="dxa" w:w="90"/>
+            </w:tcMar>
+          </w:tcPr>
+          <w:p>
+            <w:pPr>
+              <w:spacing w:after="0"/>
+            </w:pPr>
+            <w:r>
+              <w:rPr>
+                <w:sz w:val="19"/>
+                <w:szCs w:val="19"/>
+              </w:rPr>
+              <w:t xml:space="preserve">Skipped if session already COMPLETED</w:t>
             </w:r>
           </w:p>
         </w:tc>
@@ -12020,47 +12014,70 @@
         </w:trPr>
         <w:tc>
           <w:tcPr>
-            <w:tcW w:type="dxa" w:w="2498"/>
-            <w:tcMar>
-              <w:top w:type="dxa" w:w="50"/>
-              <w:left w:type="dxa" w:w="90"/>
-              <w:bottom w:type="dxa" w:w="50"/>
-              <w:right w:type="dxa" w:w="90"/>
-            </w:tcMar>
-          </w:tcPr>
-          <w:p>
-            <w:pPr>
-              <w:spacing w:after="0"/>
-            </w:pPr>
-            <w:r>
-              <w:rPr>
-                <w:sz w:val="19"/>
-                <w:szCs w:val="19"/>
-              </w:rPr>
-              <w:t xml:space="preserve">session-close</w:t>
-            </w:r>
-          </w:p>
-        </w:tc>
-        <w:tc>
-          <w:tcPr>
-            <w:tcW w:type="dxa" w:w="7140"/>
-            <w:tcMar>
-              <w:top w:type="dxa" w:w="50"/>
-              <w:left w:type="dxa" w:w="90"/>
-              <w:bottom w:type="dxa" w:w="50"/>
-              <w:right w:type="dxa" w:w="90"/>
-            </w:tcMar>
-          </w:tcPr>
-          <w:p>
-            <w:pPr>
-              <w:spacing w:after="0"/>
-            </w:pPr>
-            <w:r>
-              <w:rPr>
-                <w:sz w:val="19"/>
-                <w:szCs w:val="19"/>
-              </w:rPr>
-              <w:t xml:space="preserve">End + 2 min</w:t>
+            <w:tcW w:type="dxa" w:w="1770"/>
+            <w:tcMar>
+              <w:top w:type="dxa" w:w="50"/>
+              <w:left w:type="dxa" w:w="90"/>
+              <w:bottom w:type="dxa" w:w="50"/>
+              <w:right w:type="dxa" w:w="90"/>
+            </w:tcMar>
+          </w:tcPr>
+          <w:p>
+            <w:pPr>
+              <w:spacing w:after="0"/>
+            </w:pPr>
+            <w:r>
+              <w:rPr>
+                <w:sz w:val="19"/>
+                <w:szCs w:val="19"/>
+              </w:rPr>
+              <w:t xml:space="preserve">send-email / send-push</w:t>
+            </w:r>
+          </w:p>
+        </w:tc>
+        <w:tc>
+          <w:tcPr>
+            <w:tcW w:type="dxa" w:w="3933"/>
+            <w:tcMar>
+              <w:top w:type="dxa" w:w="50"/>
+              <w:left w:type="dxa" w:w="90"/>
+              <w:bottom w:type="dxa" w:w="50"/>
+              <w:right w:type="dxa" w:w="90"/>
+            </w:tcMar>
+          </w:tcPr>
+          <w:p>
+            <w:pPr>
+              <w:spacing w:after="0"/>
+            </w:pPr>
+            <w:r>
+              <w:rPr>
+                <w:sz w:val="19"/>
+                <w:szCs w:val="19"/>
+              </w:rPr>
+              <w:t xml:space="preserve">Queued by the jobs above and by app events</w:t>
+            </w:r>
+          </w:p>
+        </w:tc>
+        <w:tc>
+          <w:tcPr>
+            <w:tcW w:type="dxa" w:w="3935"/>
+            <w:tcMar>
+              <w:top w:type="dxa" w:w="50"/>
+              <w:left w:type="dxa" w:w="90"/>
+              <w:bottom w:type="dxa" w:w="50"/>
+              <w:right w:type="dxa" w:w="90"/>
+            </w:tcMar>
+          </w:tcPr>
+          <w:p>
+            <w:pPr>
+              <w:spacing w:after="0"/>
+            </w:pPr>
+            <w:r>
+              <w:rPr>
+                <w:sz w:val="19"/>
+                <w:szCs w:val="19"/>
+              </w:rPr>
+              <w:t xml:space="preserve">pg-boss retries with backoff; failures stay visible</w:t>
             </w:r>
           </w:p>
         </w:tc>
@@ -12072,57 +12089,70 @@
         </w:trPr>
         <w:tc>
           <w:tcPr>
-            <w:tcW w:type="dxa" w:w="2498"/>
-            <w:tcMar>
-              <w:top w:type="dxa" w:w="50"/>
-              <w:left w:type="dxa" w:w="90"/>
-              <w:bottom w:type="dxa" w:w="50"/>
-              <w:right w:type="dxa" w:w="90"/>
-            </w:tcMar>
-          </w:tcPr>
-          <w:p>
-            <w:pPr>
-              <w:spacing w:after="0"/>
-            </w:pPr>
-            <w:r>
-              <w:rPr>
-                <w:sz w:val="19"/>
-                <w:szCs w:val="19"/>
-              </w:rPr>
-              <w:t xml:space="preserve">sweep</w:t>
-            </w:r>
-          </w:p>
-        </w:tc>
-        <w:tc>
-          <w:tcPr>
-            <w:tcW w:type="dxa" w:w="7140"/>
-            <w:tcMar>
-              <w:top w:type="dxa" w:w="50"/>
-              <w:left w:type="dxa" w:w="90"/>
-              <w:bottom w:type="dxa" w:w="50"/>
-              <w:right w:type="dxa" w:w="90"/>
-            </w:tcMar>
-          </w:tcPr>
-          <w:p>
-            <w:pPr>
-              <w:spacing w:after="0"/>
-            </w:pPr>
-            <w:r>
-              <w:rPr>
-                <w:b/>
-                <w:bCs/>
-                <w:color w:val="C55A11"/>
-                <w:sz w:val="19"/>
-                <w:szCs w:val="19"/>
-              </w:rPr>
-              <w:t xml:space="preserve">[v1.1]</w:t>
-            </w:r>
-            <w:r>
-              <w:rPr>
-                <w:sz w:val="19"/>
-                <w:szCs w:val="19"/>
-              </w:rPr>
-              <w:t xml:space="preserve"> Every minute: rebuild any missing job from the database. Every job is idempotent</w:t>
+            <w:tcW w:type="dxa" w:w="1770"/>
+            <w:tcMar>
+              <w:top w:type="dxa" w:w="50"/>
+              <w:left w:type="dxa" w:w="90"/>
+              <w:bottom w:type="dxa" w:w="50"/>
+              <w:right w:type="dxa" w:w="90"/>
+            </w:tcMar>
+          </w:tcPr>
+          <w:p>
+            <w:pPr>
+              <w:spacing w:after="0"/>
+            </w:pPr>
+            <w:r>
+              <w:rPr>
+                <w:sz w:val="19"/>
+                <w:szCs w:val="19"/>
+              </w:rPr>
+              <w:t xml:space="preserve">reconcile</w:t>
+            </w:r>
+          </w:p>
+        </w:tc>
+        <w:tc>
+          <w:tcPr>
+            <w:tcW w:type="dxa" w:w="3933"/>
+            <w:tcMar>
+              <w:top w:type="dxa" w:w="50"/>
+              <w:left w:type="dxa" w:w="90"/>
+              <w:bottom w:type="dxa" w:w="50"/>
+              <w:right w:type="dxa" w:w="90"/>
+            </w:tcMar>
+          </w:tcPr>
+          <w:p>
+            <w:pPr>
+              <w:spacing w:after="0"/>
+            </w:pPr>
+            <w:r>
+              <w:rPr>
+                <w:sz w:val="19"/>
+                <w:szCs w:val="19"/>
+              </w:rPr>
+              <w:t xml:space="preserve">Worker startup + every 15 min</w:t>
+            </w:r>
+          </w:p>
+        </w:tc>
+        <w:tc>
+          <w:tcPr>
+            <w:tcW w:type="dxa" w:w="3935"/>
+            <w:tcMar>
+              <w:top w:type="dxa" w:w="50"/>
+              <w:left w:type="dxa" w:w="90"/>
+              <w:bottom w:type="dxa" w:w="50"/>
+              <w:right w:type="dxa" w:w="90"/>
+            </w:tcMar>
+          </w:tcPr>
+          <w:p>
+            <w:pPr>
+              <w:spacing w:after="0"/>
+            </w:pPr>
+            <w:r>
+              <w:rPr>
+                <w:sz w:val="19"/>
+                <w:szCs w:val="19"/>
+              </w:rPr>
+              <w:t xml:space="preserve">Re-creates missing jobs for future bookings</w:t>
             </w:r>
           </w:p>
         </w:tc>
@@ -12132,14 +12162,6 @@
       <w:pPr>
         <w:spacing w:after="120"/>
       </w:pPr>
-    </w:p>
-    <w:p>
-      <w:pPr>
-        <w:pStyle w:val="Heading2"/>
-      </w:pPr>
-      <w:r>
-        <w:t xml:space="preserve">9.5 LiveKit rules</w:t>
-      </w:r>
     </w:p>
     <w:p>
       <w:pPr>
@@ -12151,7 +12173,14 @@
         <w:spacing w:after="60"/>
       </w:pPr>
       <w:r>
-        <w:t xml:space="preserve">Tokens generated server-side only, 2-hour TTL, in-memory on the client.</w:t>
+        <w:rPr>
+          <w:b/>
+          <w:bCs/>
+        </w:rPr>
+        <w:t xml:space="preserve">Rematch (T+1) and solo offer (T+3)</w:t>
+      </w:r>
+      <w:r>
+        <w:t xml:space="preserve"> are triggered from the waiting user's room screen; the server checks the partner's presence from LiveKit webhooks before acting.</w:t>
       </w:r>
     </w:p>
     <w:p>
@@ -12164,7 +12193,22 @@
         <w:spacing w:after="60"/>
       </w:pPr>
       <w:r>
-        <w:t xml:space="preserve">Room name = session id. adaptiveStream and dynacast on.</w:t>
+        <w:rPr>
+          <w:b/>
+          <w:bCs/>
+        </w:rPr>
+        <w:t xml:space="preserve">Suspension check</w:t>
+      </w:r>
+      <w:r>
+        <w:t xml:space="preserve"> runs inline right after each new strike or report, not on a timer.</w:t>
+      </w:r>
+    </w:p>
+    <w:p>
+      <w:pPr>
+        <w:pStyle w:val="Heading2"/>
+      </w:pPr>
+      <w:r>
+        <w:t xml:space="preserve">9.5 LiveKit rules</w:t>
       </w:r>
     </w:p>
     <w:p>
@@ -12177,7 +12221,7 @@
         <w:spacing w:after="60"/>
       </w:pPr>
       <w:r>
-        <w:t xml:space="preserve">Camera-off and Quiet enforced in the token's permissions (no camera / no microphone source).</w:t>
+        <w:t xml:space="preserve">Tokens generated server-side only, 2-hour TTL, in-memory on the client.</w:t>
       </w:r>
     </w:p>
     <w:p>
@@ -12190,6 +12234,32 @@
         <w:spacing w:after="60"/>
       </w:pPr>
       <w:r>
+        <w:t xml:space="preserve">Room name = session id. Simulcast (3 layers, up to 720p), adaptiveStream and dynacast on. Data saver caps the publisher at the 360p layer.</w:t>
+      </w:r>
+    </w:p>
+    <w:p>
+      <w:pPr>
+        <w:pStyle w:val="ListParagraph"/>
+        <w:numPr>
+          <w:ilvl w:val="0"/>
+          <w:numId w:val="2"/>
+        </w:numPr>
+        <w:spacing w:after="60"/>
+      </w:pPr>
+      <w:r>
+        <w:t xml:space="preserve">Camera-off and Quiet enforced in the token's permissions (no camera / no microphone source).</w:t>
+      </w:r>
+    </w:p>
+    <w:p>
+      <w:pPr>
+        <w:pStyle w:val="ListParagraph"/>
+        <w:numPr>
+          <w:ilvl w:val="0"/>
+          <w:numId w:val="2"/>
+        </w:numPr>
+        <w:spacing w:after="60"/>
+      </w:pPr>
+      <w:r>
         <w:rPr>
           <w:b/>
           <w:bCs/>
@@ -12248,21 +12318,7 @@
           <w:sz w:val="15"/>
           <w:szCs w:val="15"/>
         </w:rPr>
-        <w:t xml:space="preserve">  email          String?    @unique</w:t>
-      </w:r>
-    </w:p>
-    <w:p>
-      <w:pPr>
-        <w:shd w:fill="F3F4F6" w:color="auto" w:val="clear"/>
-        <w:spacing w:after="0" w:line="240"/>
-      </w:pPr>
-      <w:r>
-        <w:rPr>
-          <w:rFonts w:ascii="Consolas" w:cs="Consolas" w:eastAsia="Consolas" w:hAnsi="Consolas"/>
-          <w:sz w:val="15"/>
-          <w:szCs w:val="15"/>
-        </w:rPr>
-        <w:t xml:space="preserve">  phone          String?    @unique</w:t>
+        <w:t xml:space="preserve">  email          String     @unique          // [v1.1] no phone sign-in</w:t>
       </w:r>
     </w:p>
     <w:p>
@@ -12318,6 +12374,20 @@
           <w:sz w:val="15"/>
           <w:szCs w:val="15"/>
         </w:rPr>
+        <w:t xml:space="preserve">  dataSaver      Boolean    @default(false)  // [v1.1] caps video at 360p</w:t>
+      </w:r>
+    </w:p>
+    <w:p>
+      <w:pPr>
+        <w:shd w:fill="F3F4F6" w:color="auto" w:val="clear"/>
+        <w:spacing w:after="0" w:line="240"/>
+      </w:pPr>
+      <w:r>
+        <w:rPr>
+          <w:rFonts w:ascii="Consolas" w:cs="Consolas" w:eastAsia="Consolas" w:hAnsi="Consolas"/>
+          <w:sz w:val="15"/>
+          <w:szCs w:val="15"/>
+        </w:rPr>
         <w:t xml:space="preserve">  timezone       String     @default("UTC")</w:t>
       </w:r>
     </w:p>
@@ -12682,6 +12752,20 @@
           <w:sz w:val="15"/>
           <w:szCs w:val="15"/>
         </w:rPr>
+        <w:t xml:space="preserve">  relaxedAt     DateTime?     // [v1.1] T-10 relax done</w:t>
+      </w:r>
+    </w:p>
+    <w:p>
+      <w:pPr>
+        <w:shd w:fill="F3F4F6" w:color="auto" w:val="clear"/>
+        <w:spacing w:after="0" w:line="240"/>
+      </w:pPr>
+      <w:r>
+        <w:rPr>
+          <w:rFonts w:ascii="Consolas" w:cs="Consolas" w:eastAsia="Consolas" w:hAnsi="Consolas"/>
+          <w:sz w:val="15"/>
+          <w:szCs w:val="15"/>
+        </w:rPr>
         <w:t xml:space="preserve">  createdAt     DateTime      @default(now())</w:t>
       </w:r>
     </w:p>
@@ -13000,7 +13084,18 @@
     </w:p>
     <w:p>
       <w:r>
-        <w:t xml:space="preserve">Better Auth adds its own account, session and verification tables.</w:t>
+        <w:t xml:space="preserve">Better Auth adds its own account, session and verification tables. pg-boss keeps its jobs in its own </w:t>
+      </w:r>
+      <w:r>
+        <w:rPr>
+          <w:rFonts w:ascii="Consolas" w:cs="Consolas" w:eastAsia="Consolas" w:hAnsi="Consolas"/>
+          <w:sz w:val="19"/>
+          <w:szCs w:val="19"/>
+        </w:rPr>
+        <w:t xml:space="preserve">pgboss</w:t>
+      </w:r>
+      <w:r>
+        <w:t xml:space="preserve"> schema, outside Prisma's migrations.</w:t>
       </w:r>
     </w:p>
     <w:p>
@@ -14648,7 +14743,7 @@
                 <w:sz w:val="19"/>
                 <w:szCs w:val="19"/>
               </w:rPr>
-              <w:t xml:space="preserve">~450 MB per 50-min session at the v1.1 preset; pick a plan with large included traffic</w:t>
+              <w:t xml:space="preserve">Up to ~1.3 GB per 50-min HD session (less on weak connections or with Data saver); pick a plan with large included traffic</w:t>
             </w:r>
           </w:p>
         </w:tc>
@@ -15470,7 +15565,7 @@
                 <w:sz w:val="19"/>
                 <w:szCs w:val="19"/>
               </w:rPr>
-              <w:t xml:space="preserve">Video preset, goal/check-out, chat, tasks, screen share, report &amp; block, LiveKit webhooks, reconnect, rematch T+1 / solo T+3</w:t>
+              <w:t xml:space="preserve">Dynamic video + Data saver, goal/check-out, chat, tasks, screen share, report &amp; block, LiveKit webhooks, reconnect, rematch T+1 / solo T+3</w:t>
             </w:r>
           </w:p>
         </w:tc>
@@ -15568,7 +15663,7 @@
                 <w:sz w:val="19"/>
                 <w:szCs w:val="19"/>
               </w:rPr>
-              <w:t xml:space="preserve">Reminders (email + .ics + push), T-10 relax, no-show T+5, strikes, sweep. Server and domain live</w:t>
+              <w:t xml:space="preserve">pg-boss replaces BullMQ (Redis removed). Reminders (email + .ics + push), T-10 relax, no-show T+5, strikes. Server and domain live</w:t>
             </w:r>
           </w:p>
         </w:tc>
@@ -15773,7 +15868,7 @@
                 <w:sz w:val="19"/>
                 <w:szCs w:val="19"/>
               </w:rPr>
-              <w:t xml:space="preserve">Payments (card + Paymob) and quota enforcement, phone OTP + Facebook, fixes from beta, legal review. Public launch date set after the mid-December review</w:t>
+              <w:t xml:space="preserve">Payments (card + Paymob) and quota enforcement, fixes from beta, legal review. Public launch date set after the mid-December review</w:t>
             </w:r>
           </w:p>
         </w:tc>
@@ -16227,6 +16322,68 @@
                 <w:szCs w:val="19"/>
               </w:rPr>
               <w:t xml:space="preserve">Week 2</w:t>
+            </w:r>
+          </w:p>
+        </w:tc>
+      </w:tr>
+      <w:tr>
+        <w:trPr>
+          <w:cantSplit/>
+          <w:tblHeader w:val="false"/>
+        </w:trPr>
+        <w:tc>
+          <w:tcPr>
+            <w:tcW w:type="dxa" w:w="5209"/>
+            <w:tcMar>
+              <w:top w:type="dxa" w:w="50"/>
+              <w:left w:type="dxa" w:w="90"/>
+              <w:bottom w:type="dxa" w:w="50"/>
+              <w:right w:type="dxa" w:w="90"/>
+            </w:tcMar>
+          </w:tcPr>
+          <w:p>
+            <w:pPr>
+              <w:spacing w:after="0"/>
+            </w:pPr>
+            <w:r>
+              <w:rPr>
+                <w:b/>
+                <w:bCs/>
+                <w:color w:val="C55A11"/>
+                <w:sz w:val="19"/>
+                <w:szCs w:val="19"/>
+              </w:rPr>
+              <w:t xml:space="preserve">[v1.1]</w:t>
+            </w:r>
+            <w:r>
+              <w:rPr>
+                <w:sz w:val="19"/>
+                <w:szCs w:val="19"/>
+              </w:rPr>
+              <w:t xml:space="preserve"> Confirm pg-boss runs under Bun; otherwise run the worker container on Node</w:t>
+            </w:r>
+          </w:p>
+        </w:tc>
+        <w:tc>
+          <w:tcPr>
+            <w:tcW w:type="dxa" w:w="4429"/>
+            <w:tcMar>
+              <w:top w:type="dxa" w:w="50"/>
+              <w:left w:type="dxa" w:w="90"/>
+              <w:bottom w:type="dxa" w:w="50"/>
+              <w:right w:type="dxa" w:w="90"/>
+            </w:tcMar>
+          </w:tcPr>
+          <w:p>
+            <w:pPr>
+              <w:spacing w:after="0"/>
+            </w:pPr>
+            <w:r>
+              <w:rPr>
+                <w:sz w:val="19"/>
+                <w:szCs w:val="19"/>
+              </w:rPr>
+              <w:t xml:space="preserve">Week 6</w:t>
             </w:r>
           </w:p>
         </w:tc>
@@ -16752,7 +16909,7 @@
                 <w:sz w:val="19"/>
                 <w:szCs w:val="19"/>
               </w:rPr>
-              <w:t xml:space="preserve">Focusmate experience (camera and Quiet as soft preferences with badges, booked people on calendar, lock at booking, rematch T+1 / solo T+3); beta sign-in = email + Google; one-server hosting; REST-only backend, Better Auth, Redis/BullMQ, socket.io; video preset; beta date and success criteria. Details in </w:t>
+              <w:t xml:space="preserve">Focusmate experience (camera and Quiet as soft preferences with badges, booked people on calendar, lock at booking, rematch T+1 / solo T+3); sign-in = email + Google only; one-server hosting; REST-only backend, Better Auth, pg-boss (no Redis), socket.io; dynamic video up to 720p with Data saver; beta date and success criteria. Details in </w:t>
             </w:r>
             <w:r>
               <w:rPr>

</xml_diff>